<commit_message>
Letterhead: keep only +91 79864 04564
Co-Authored-By: Claude Opus 5.5 <noreply@anthropic.com>
Claude-Session: https://claude.ai/code/session_01G61VfdThxTuJa9vLSWusaf
</commit_message>
<xml_diff>
--- a/letterhead/Infinity-Letterhead.docx
+++ b/letterhead/Infinity-Letterhead.docx
@@ -275,27 +275,10 @@
               <w:b w:val="false"/>
               <w:bCs w:val="false"/>
               <w:color w:val="1C1B19"/>
-              <w:sz w:val="15"/>
-              <w:szCs w:val="15"/>
+              <w:sz w:val="17"/>
+              <w:szCs w:val="17"/>
             </w:rPr>
-            <w:t xml:space="preserve">+91 79864 04564   ·   +91 98771 68353</w:t>
-          </w:r>
-        </w:p>
-        <w:p>
-          <w:pPr>
-            <w:spacing w:after="20"/>
-            <w:jc w:val="right"/>
-          </w:pPr>
-          <w:r>
-            <w:rPr>
-              <w:rFonts w:ascii="Poppins" w:cs="Poppins" w:eastAsia="Poppins" w:hAnsi="Poppins"/>
-              <w:b w:val="false"/>
-              <w:bCs w:val="false"/>
-              <w:color w:val="1C1B19"/>
-              <w:sz w:val="15"/>
-              <w:szCs w:val="15"/>
-            </w:rPr>
-            <w:t xml:space="preserve">+91 98782 25225   ·   +91 93243 87537</w:t>
+            <w:t xml:space="preserve">+91 79864 04564</w:t>
           </w:r>
         </w:p>
         <w:p>

</xml_diff>